<commit_message>
Forgot to explain architecture of T5. FACEPALM. Adding it now.
</commit_message>
<xml_diff>
--- a/T5_TX/TAREA_5.docx
+++ b/T5_TX/TAREA_5.docx
@@ -39,6 +39,9 @@
     </w:p>
     <w:p>
       <w:r>
+        <w:rPr>
+          <w:noProof/>
+        </w:rPr>
         <w:drawing>
           <wp:inline distT="0" distB="0" distL="0" distR="0" wp14:anchorId="3D6B5A24" wp14:editId="1C34E308">
             <wp:extent cx="5612130" cy="2940685"/>
@@ -89,6 +92,267 @@
         </w:drawing>
       </w:r>
     </w:p>
+    <w:p>
+      <w:r>
+        <w:t>SEÑALES:</w:t>
+      </w:r>
+    </w:p>
+    <w:p>
+      <w:r>
+        <w:tab/>
+        <w:t>BAUDRATE: Define cuantos ciclos de reloj por bit.</w:t>
+      </w:r>
+    </w:p>
+    <w:p>
+      <w:r>
+        <w:tab/>
+        <w:t>CLOCK: Señal de reloj.</w:t>
+      </w:r>
+    </w:p>
+    <w:p>
+      <w:r>
+        <w:tab/>
+        <w:t xml:space="preserve">RESET: Señal de </w:t>
+      </w:r>
+      <w:proofErr w:type="spellStart"/>
+      <w:r>
+        <w:t>reset</w:t>
+      </w:r>
+      <w:proofErr w:type="spellEnd"/>
+      <w:r>
+        <w:t>, activo en bajo.</w:t>
+      </w:r>
+    </w:p>
+    <w:p>
+      <w:r>
+        <w:tab/>
+        <w:t>DATA_IN: Señal del dato de 8 bits.</w:t>
+      </w:r>
+    </w:p>
+    <w:p>
+      <w:r>
+        <w:tab/>
+      </w:r>
+      <w:r>
+        <w:t xml:space="preserve">SEND_BIT: Señal </w:t>
+      </w:r>
+      <w:r>
+        <w:t>de</w:t>
+      </w:r>
+      <w:r>
+        <w:t xml:space="preserve"> </w:t>
+      </w:r>
+      <w:r>
+        <w:t>un ciclo de reloj en alto, activa el proceso de envío de dato.</w:t>
+      </w:r>
+    </w:p>
+    <w:p>
+      <w:r>
+        <w:tab/>
+        <w:t xml:space="preserve">PARITY_SELECTOR: </w:t>
+      </w:r>
+      <w:r>
+        <w:t>S</w:t>
+      </w:r>
+      <w:r>
+        <w:t>eñ</w:t>
+      </w:r>
+      <w:r>
+        <w:t>al de 2 bits que define si hay paridad y si es non o par.</w:t>
+      </w:r>
+    </w:p>
+    <w:p>
+      <w:r>
+        <w:tab/>
+      </w:r>
+      <w:r>
+        <w:t>LOAD_NOT_SHIFT: Señal controlada por la</w:t>
+      </w:r>
+      <w:r>
+        <w:t xml:space="preserve"> FSM para cargar el dato y recorrerlo hacia la salida.</w:t>
+      </w:r>
+    </w:p>
+    <w:p>
+      <w:r>
+        <w:tab/>
+        <w:t xml:space="preserve">STATE: Define si sale el dato o 1 y 0 para </w:t>
+      </w:r>
+      <w:proofErr w:type="spellStart"/>
+      <w:r>
+        <w:t>start</w:t>
+      </w:r>
+      <w:proofErr w:type="spellEnd"/>
+      <w:r>
+        <w:t xml:space="preserve"> o stop.</w:t>
+      </w:r>
+    </w:p>
+    <w:p>
+      <w:r>
+        <w:tab/>
+        <w:t xml:space="preserve">READY: Señal que se activa al </w:t>
+      </w:r>
+      <w:r>
+        <w:t>terminar de enviar el dato para indicar que se puede enviar otro dato.</w:t>
+      </w:r>
+    </w:p>
+    <w:p>
+      <w:r>
+        <w:lastRenderedPageBreak/>
+        <w:tab/>
+        <w:t xml:space="preserve">DATA_OUT: Señal de un bit por la cual va pasando la señal UART con </w:t>
+      </w:r>
+      <w:proofErr w:type="spellStart"/>
+      <w:r>
+        <w:t>start</w:t>
+      </w:r>
+      <w:proofErr w:type="spellEnd"/>
+      <w:r>
+        <w:t>, dato, paridad y stop.</w:t>
+      </w:r>
+    </w:p>
+    <w:p>
+      <w:r>
+        <w:t>MODULOS:</w:t>
+      </w:r>
+    </w:p>
+    <w:p>
+      <w:pPr>
+        <w:ind w:firstLine="708"/>
+      </w:pPr>
+      <w:r>
+        <w:t>CLK DIVIDER: Se cambiar</w:t>
+      </w:r>
+      <w:r>
+        <w:t>á</w:t>
+      </w:r>
+      <w:r>
+        <w:t xml:space="preserve"> p</w:t>
+      </w:r>
+      <w:r>
+        <w:t xml:space="preserve">or un </w:t>
+      </w:r>
+      <w:r>
+        <w:t>módulo</w:t>
+      </w:r>
+      <w:r>
+        <w:t xml:space="preserve"> que habilita una señal que se manda a los otros módulos y ya no remplaza la señal del </w:t>
+      </w:r>
+      <w:proofErr w:type="spellStart"/>
+      <w:r>
+        <w:t>clk</w:t>
+      </w:r>
+      <w:proofErr w:type="spellEnd"/>
+      <w:r>
+        <w:t>.</w:t>
+      </w:r>
+    </w:p>
+    <w:p>
+      <w:pPr>
+        <w:ind w:firstLine="708"/>
+      </w:pPr>
+      <w:r>
+        <w:t xml:space="preserve">PISO: </w:t>
+      </w:r>
+      <w:r>
+        <w:t>Recibe el dato en paralelo y recorre el dato LSB primero.</w:t>
+      </w:r>
+    </w:p>
+    <w:p>
+      <w:pPr>
+        <w:ind w:firstLine="708"/>
+      </w:pPr>
+      <w:r>
+        <w:t>MUX: Decide cual señal sale para armar el dato por UART de acuerdo con el estado.</w:t>
+      </w:r>
+    </w:p>
+    <w:p>
+      <w:pPr>
+        <w:ind w:firstLine="708"/>
+        <w:rPr>
+          <w:u w:val="single"/>
+        </w:rPr>
+      </w:pPr>
+      <w:r>
+        <w:t xml:space="preserve">FSM: Se sale de estado IDLE cuando se recibe la señal de </w:t>
+      </w:r>
+      <w:proofErr w:type="spellStart"/>
+      <w:r>
+        <w:t>send_bit</w:t>
+      </w:r>
+      <w:proofErr w:type="spellEnd"/>
+      <w:r>
+        <w:t xml:space="preserve">. El estado START manda bit 0 mediante la señal de </w:t>
+      </w:r>
+      <w:proofErr w:type="spellStart"/>
+      <w:r>
+        <w:t>state</w:t>
+      </w:r>
+      <w:proofErr w:type="spellEnd"/>
+      <w:r>
+        <w:t xml:space="preserve"> y corrigiendo espera ciclos de reloj acorde al </w:t>
+      </w:r>
+      <w:proofErr w:type="spellStart"/>
+      <w:r>
+        <w:t>baudrate</w:t>
+      </w:r>
+      <w:proofErr w:type="spellEnd"/>
+      <w:r>
+        <w:t xml:space="preserve"> indicado por una señal </w:t>
+      </w:r>
+      <w:proofErr w:type="spellStart"/>
+      <w:r>
+        <w:t>enable</w:t>
+      </w:r>
+      <w:proofErr w:type="spellEnd"/>
+      <w:r>
+        <w:t xml:space="preserve"> para pasar al siguiente dato. El estado de SHIFT hace el </w:t>
+      </w:r>
+      <w:proofErr w:type="spellStart"/>
+      <w:r>
+        <w:t>shifteo</w:t>
+      </w:r>
+      <w:proofErr w:type="spellEnd"/>
+      <w:r>
+        <w:t xml:space="preserve"> y pasa al estado que checa si ya pasaron los 8 ciclos necesarios para pasar el dato, si no han pasado vuelve al SHIFT, sino pasa al estado de PARIDAD. Ahí se checa si se necesita la paridad o no </w:t>
+      </w:r>
+      <w:proofErr w:type="gramStart"/>
+      <w:r>
+        <w:t>de acuerdo al</w:t>
+      </w:r>
+      <w:proofErr w:type="gramEnd"/>
+      <w:r>
+        <w:t xml:space="preserve"> </w:t>
+      </w:r>
+      <w:proofErr w:type="spellStart"/>
+      <w:r>
+        <w:t>parity</w:t>
+      </w:r>
+      <w:proofErr w:type="spellEnd"/>
+      <w:r>
+        <w:t xml:space="preserve"> selector, sino se necesita pasa al STOP, si </w:t>
+      </w:r>
+      <w:proofErr w:type="spellStart"/>
+      <w:r>
+        <w:t>si</w:t>
+      </w:r>
+      <w:proofErr w:type="spellEnd"/>
+      <w:r>
+        <w:t xml:space="preserve"> pues manda el dato que corresponda a la paridad y luego al STOP. STOP manda 1 por dos </w:t>
+      </w:r>
+      <w:r>
+        <w:t xml:space="preserve">tiempos de bit, activa READY y luego regresa a IDLE. Durante todos los estados si se recibe el RESET se regresa al estado IDLE también, en IDLE se </w:t>
+      </w:r>
+      <w:proofErr w:type="gramStart"/>
+      <w:r>
+        <w:t>resetean</w:t>
+      </w:r>
+      <w:proofErr w:type="gramEnd"/>
+      <w:r>
+        <w:t xml:space="preserve"> las señales como OUT en 1.</w:t>
+      </w:r>
+    </w:p>
+    <w:p/>
+    <w:p/>
     <w:p>
       <w:pPr>
         <w:rPr>
@@ -778,6 +1042,7 @@
   <w:style w:type="character" w:default="1" w:styleId="Fuentedeprrafopredeter">
     <w:name w:val="Default Paragraph Font"/>
     <w:uiPriority w:val="1"/>
+    <w:semiHidden/>
     <w:unhideWhenUsed/>
   </w:style>
   <w:style w:type="table" w:default="1" w:styleId="Tablanormal">

</xml_diff>